<commit_message>
fix: polish PMM public copy and downloadable resources
</commit_message>
<xml_diff>
--- a/assets/downloads/ehs-sil-pmm-guide.docx
+++ b/assets/downloads/ehs-sil-pmm-guide.docx
@@ -346,7 +346,7 @@
         <w:rPr>
           <w:rFonts w:ascii="Heiti SC" w:hAnsi="Heiti SC" w:eastAsia="Heiti SC" w:cs="Heiti SC"/>
         </w:rPr>
-        <w:t>隐私与脱敏</w:t>
+        <w:t>隐私与文件保管</w:t>
       </w:r>
     </w:p>
     <w:p>
@@ -355,14 +355,6 @@
           <w:rFonts w:ascii="Heiti SC" w:hAnsi="Heiti SC" w:eastAsia="Heiti SC" w:cs="Heiti SC"/>
         </w:rPr>
         <w:t>只使用岗位或人员代号，不填写姓名、工号、联系方式、健康隐私或商业秘密。证据使用代号，不粘贴原始人员资料。分享前再次审核自由文本、附件、文件属性和可识别场景。保存位置、访问权限和留存期限按企业适用规则确定。</w:t>
-      </w:r>
-    </w:p>
-    <w:p>
-      <w:r>
-        <w:rPr>
-          <w:rFonts w:ascii="Heiti SC" w:hAnsi="Heiti SC" w:eastAsia="Heiti SC" w:cs="Heiti SC"/>
-        </w:rPr>
-        <w:t>本版依据用户提供的内部程序与对话表重新制作，保留公平对话、情境分析、行动和跟进思路。未发布原企业名称或标识、人员元数据、内部文号、隐藏表格数据和原判责图。修正“示范行为”的翻译，取消仅凭利益动机判定恶意的分支。不是未经改动的原企业制度。</w:t>
       </w:r>
     </w:p>
     <w:p>
@@ -413,7 +405,7 @@
         <w:rPr>
           <w:rFonts w:ascii="Heiti SC" w:hAnsi="Heiti SC" w:eastAsia="Heiti SC" w:cs="Heiti SC"/>
         </w:rPr>
-        <w:t>NHS England 英格兰国家医疗服务体系：Being fair tool 公平对待工具。https://www.england.nhs.uk/publication/being-fair-tool/。仅借鉴情境与支持复核思路，原工具适用于医疗行业，不是工业处分标准。</w:t>
+        <w:t>NHS England 英格兰国家医疗服务体系：Being fair tool 公平对待工具。https://www.england.nhs.uk/publication/being-fair-tool/。仅借鉴情境与支持复核思路，该参考适用于医疗行业，不是工业处分标准。</w:t>
       </w:r>
     </w:p>
     <w:p>
@@ -446,7 +438,7 @@
       <w:rPr>
         <w:rFonts w:ascii="Heiti SC" w:hAnsi="Heiti SC" w:eastAsia="Heiti SC" w:cs="Heiti SC"/>
       </w:rPr>
-      <w:t>PMM-2026.09-v1  ·  脱敏改编版  ·  2026-09-19</w:t>
+      <w:t>PMM-2026.09-v1  ·  EHS-SIL  ·  2026-09-19</w:t>
     </w:r>
   </w:p>
 </w:ftr>

</xml_diff>

<commit_message>
fix: polish PMM public copy and downloadable resources (#28)
Co-authored-by: EHS-SIL <ehs-sil@users.noreply.github.com>
</commit_message>
<xml_diff>
--- a/assets/downloads/ehs-sil-pmm-guide.docx
+++ b/assets/downloads/ehs-sil-pmm-guide.docx
@@ -346,7 +346,7 @@
         <w:rPr>
           <w:rFonts w:ascii="Heiti SC" w:hAnsi="Heiti SC" w:eastAsia="Heiti SC" w:cs="Heiti SC"/>
         </w:rPr>
-        <w:t>隐私与脱敏</w:t>
+        <w:t>隐私与文件保管</w:t>
       </w:r>
     </w:p>
     <w:p>
@@ -355,14 +355,6 @@
           <w:rFonts w:ascii="Heiti SC" w:hAnsi="Heiti SC" w:eastAsia="Heiti SC" w:cs="Heiti SC"/>
         </w:rPr>
         <w:t>只使用岗位或人员代号，不填写姓名、工号、联系方式、健康隐私或商业秘密。证据使用代号，不粘贴原始人员资料。分享前再次审核自由文本、附件、文件属性和可识别场景。保存位置、访问权限和留存期限按企业适用规则确定。</w:t>
-      </w:r>
-    </w:p>
-    <w:p>
-      <w:r>
-        <w:rPr>
-          <w:rFonts w:ascii="Heiti SC" w:hAnsi="Heiti SC" w:eastAsia="Heiti SC" w:cs="Heiti SC"/>
-        </w:rPr>
-        <w:t>本版依据用户提供的内部程序与对话表重新制作，保留公平对话、情境分析、行动和跟进思路。未发布原企业名称或标识、人员元数据、内部文号、隐藏表格数据和原判责图。修正“示范行为”的翻译，取消仅凭利益动机判定恶意的分支。不是未经改动的原企业制度。</w:t>
       </w:r>
     </w:p>
     <w:p>
@@ -413,7 +405,7 @@
         <w:rPr>
           <w:rFonts w:ascii="Heiti SC" w:hAnsi="Heiti SC" w:eastAsia="Heiti SC" w:cs="Heiti SC"/>
         </w:rPr>
-        <w:t>NHS England 英格兰国家医疗服务体系：Being fair tool 公平对待工具。https://www.england.nhs.uk/publication/being-fair-tool/。仅借鉴情境与支持复核思路，原工具适用于医疗行业，不是工业处分标准。</w:t>
+        <w:t>NHS England 英格兰国家医疗服务体系：Being fair tool 公平对待工具。https://www.england.nhs.uk/publication/being-fair-tool/。仅借鉴情境与支持复核思路，该参考适用于医疗行业，不是工业处分标准。</w:t>
       </w:r>
     </w:p>
     <w:p>
@@ -446,7 +438,7 @@
       <w:rPr>
         <w:rFonts w:ascii="Heiti SC" w:hAnsi="Heiti SC" w:eastAsia="Heiti SC" w:cs="Heiti SC"/>
       </w:rPr>
-      <w:t>PMM-2026.09-v1  ·  脱敏改编版  ·  2026-09-19</w:t>
+      <w:t>PMM-2026.09-v1  ·  EHS-SIL  ·  2026-09-19</w:t>
     </w:r>
   </w:p>
 </w:ftr>

</xml_diff>